<commit_message>
3 notes errors fixed
</commit_message>
<xml_diff>
--- a/docs/Справочная_информация/3_Доп_ПО.docx
+++ b/docs/Справочная_информация/3_Доп_ПО.docx
@@ -15,15 +15,8 @@
           <w:lang w:val="en-US"/>
         </w:rPr>
       </w:pPr>
-      <w:r>
-        <w:rPr>
-          <w:rFonts w:hint="default"/>
-          <w:sz w:val="44"/>
-          <w:szCs w:val="28"/>
-          <w:lang w:val="en-US"/>
-        </w:rPr>
-        <w:t>s</w:t>
-      </w:r>
+      <w:bookmarkStart w:id="35" w:name="_GoBack"/>
+      <w:bookmarkEnd w:id="35"/>
       <w:r>
         <w:rPr>
           <w:rFonts w:hint="default"/>
@@ -1560,8 +1553,6 @@
         </w:rPr>
         <w:fldChar w:fldCharType="end"/>
       </w:r>
-      <w:bookmarkStart w:id="35" w:name="_GoBack"/>
-      <w:bookmarkEnd w:id="35"/>
     </w:p>
     <w:p>
       <w:pPr>
@@ -9975,6 +9966,12 @@
             <w:insideH w:val="single" w:color="auto" w:sz="4" w:space="0"/>
             <w:insideV w:val="single" w:color="auto" w:sz="4" w:space="0"/>
           </w:tblBorders>
+          <w:tblCellMar>
+            <w:top w:w="0" w:type="dxa"/>
+            <w:left w:w="108" w:type="dxa"/>
+            <w:bottom w:w="0" w:type="dxa"/>
+            <w:right w:w="108" w:type="dxa"/>
+          </w:tblCellMar>
         </w:tblPrEx>
         <w:tc>
           <w:tcPr>
@@ -11515,6 +11512,12 @@
             <w:insideH w:val="single" w:color="auto" w:sz="4" w:space="0"/>
             <w:insideV w:val="single" w:color="auto" w:sz="4" w:space="0"/>
           </w:tblBorders>
+          <w:tblCellMar>
+            <w:top w:w="0" w:type="dxa"/>
+            <w:left w:w="108" w:type="dxa"/>
+            <w:bottom w:w="0" w:type="dxa"/>
+            <w:right w:w="108" w:type="dxa"/>
+          </w:tblCellMar>
         </w:tblPrEx>
         <w:tc>
           <w:tcPr>
@@ -16937,9 +16940,9 @@
           <w:lang w:val="ru-RU" w:eastAsia="zh-CN" w:bidi="ar-SA"/>
         </w:rPr>
       </w:pPr>
-      <w:bookmarkStart w:id="32" w:name="_Toc258464778"/>
-      <w:bookmarkStart w:id="33" w:name="_Toc32683"/>
-      <w:bookmarkStart w:id="34" w:name="_Toc12266"/>
+      <w:bookmarkStart w:id="32" w:name="_Toc12266"/>
+      <w:bookmarkStart w:id="33" w:name="_Toc258464778"/>
+      <w:bookmarkStart w:id="34" w:name="_Toc32683"/>
       <w:r>
         <w:rPr>
           <w:rFonts w:hint="default" w:ascii="Times New Roman" w:hAnsi="Times New Roman" w:eastAsiaTheme="minorEastAsia" w:cstheme="minorBidi"/>
@@ -17204,12 +17207,6 @@
             <w:insideH w:val="single" w:color="auto" w:sz="4" w:space="0"/>
             <w:insideV w:val="single" w:color="auto" w:sz="4" w:space="0"/>
           </w:tblBorders>
-          <w:tblCellMar>
-            <w:top w:w="0" w:type="dxa"/>
-            <w:left w:w="108" w:type="dxa"/>
-            <w:bottom w:w="0" w:type="dxa"/>
-            <w:right w:w="108" w:type="dxa"/>
-          </w:tblCellMar>
         </w:tblPrEx>
         <w:tc>
           <w:tcPr>

</xml_diff>